<commit_message>
Update project documents and adjustments
</commit_message>
<xml_diff>
--- a/Dokumentation/Projektauftrag_LB2_Archivsoftware_BlackBox_WhiteBox.docx
+++ b/Dokumentation/Projektauftrag_LB2_Archivsoftware_BlackBox_WhiteBox.docx
@@ -342,7 +342,27 @@
                 <w:szCs w:val="24"/>
                 <w:lang w:eastAsia="de-CH"/>
               </w:rPr>
-              <w:t>Ordner "Rechnungen" in "Invoices" umbenennen</w:t>
+              <w:t>Ordner "Rechnungen" in "</w:t>
+            </w:r>
+            <w:proofErr w:type="spellStart"/>
+            <w:r>
+              <w:rPr>
+                <w:rFonts w:ascii="Arial" w:eastAsia="Times New Roman" w:hAnsi="Arial" w:cs="Arial"/>
+                <w:sz w:val="20"/>
+                <w:szCs w:val="24"/>
+                <w:lang w:eastAsia="de-CH"/>
+              </w:rPr>
+              <w:t>Invoices</w:t>
+            </w:r>
+            <w:proofErr w:type="spellEnd"/>
+            <w:r>
+              <w:rPr>
+                <w:rFonts w:ascii="Arial" w:eastAsia="Times New Roman" w:hAnsi="Arial" w:cs="Arial"/>
+                <w:sz w:val="20"/>
+                <w:szCs w:val="24"/>
+                <w:lang w:eastAsia="de-CH"/>
+              </w:rPr>
+              <w:t>" umbenennen</w:t>
             </w:r>
           </w:p>
         </w:tc>
@@ -907,7 +927,27 @@
                 <w:szCs w:val="24"/>
                 <w:lang w:eastAsia="de-CH"/>
               </w:rPr>
-              <w:t>.txt Datei importieren</w:t>
+              <w:t>.</w:t>
+            </w:r>
+            <w:proofErr w:type="spellStart"/>
+            <w:r>
+              <w:rPr>
+                <w:rFonts w:ascii="Arial" w:eastAsia="Times New Roman" w:hAnsi="Arial" w:cs="Arial"/>
+                <w:sz w:val="20"/>
+                <w:szCs w:val="24"/>
+                <w:lang w:eastAsia="de-CH"/>
+              </w:rPr>
+              <w:t>txt</w:t>
+            </w:r>
+            <w:proofErr w:type="spellEnd"/>
+            <w:r>
+              <w:rPr>
+                <w:rFonts w:ascii="Arial" w:eastAsia="Times New Roman" w:hAnsi="Arial" w:cs="Arial"/>
+                <w:sz w:val="20"/>
+                <w:szCs w:val="24"/>
+                <w:lang w:eastAsia="de-CH"/>
+              </w:rPr>
+              <w:t xml:space="preserve"> Datei importieren</w:t>
             </w:r>
           </w:p>
         </w:tc>
@@ -1870,12 +1910,21 @@
                 <w:lang w:eastAsia="de-CH"/>
               </w:rPr>
             </w:pPr>
+            <w:proofErr w:type="spellStart"/>
             <w:r>
               <w:rPr>
                 <w:rStyle w:val="HTMLCode"/>
                 <w:rFonts w:eastAsiaTheme="minorHAnsi"/>
               </w:rPr>
-              <w:t>CreateFolder()</w:t>
+              <w:t>CreateFolder</w:t>
+            </w:r>
+            <w:proofErr w:type="spellEnd"/>
+            <w:r>
+              <w:rPr>
+                <w:rStyle w:val="HTMLCode"/>
+                <w:rFonts w:eastAsiaTheme="minorHAnsi"/>
+              </w:rPr>
+              <w:t>()</w:t>
             </w:r>
           </w:p>
         </w:tc>
@@ -1939,12 +1988,21 @@
                 <w:rFonts w:eastAsiaTheme="minorHAnsi"/>
               </w:rPr>
             </w:pPr>
+            <w:proofErr w:type="spellStart"/>
             <w:r>
               <w:rPr>
                 <w:rStyle w:val="HTMLCode"/>
                 <w:rFonts w:eastAsiaTheme="minorHAnsi"/>
               </w:rPr>
-              <w:t>GetFoldersByParentId()</w:t>
+              <w:t>GetFoldersByParentId</w:t>
+            </w:r>
+            <w:proofErr w:type="spellEnd"/>
+            <w:r>
+              <w:rPr>
+                <w:rStyle w:val="HTMLCode"/>
+                <w:rFonts w:eastAsiaTheme="minorHAnsi"/>
+              </w:rPr>
+              <w:t>()</w:t>
             </w:r>
           </w:p>
         </w:tc>
@@ -2011,12 +2069,21 @@
                 <w:rFonts w:eastAsiaTheme="minorHAnsi"/>
               </w:rPr>
             </w:pPr>
+            <w:proofErr w:type="spellStart"/>
             <w:r>
               <w:rPr>
                 <w:rStyle w:val="HTMLCode"/>
                 <w:rFonts w:eastAsiaTheme="minorHAnsi"/>
               </w:rPr>
-              <w:t>ValidateFolderName()</w:t>
+              <w:t>ValidateFolderName</w:t>
+            </w:r>
+            <w:proofErr w:type="spellEnd"/>
+            <w:r>
+              <w:rPr>
+                <w:rStyle w:val="HTMLCode"/>
+                <w:rFonts w:eastAsiaTheme="minorHAnsi"/>
+              </w:rPr>
+              <w:t>()</w:t>
             </w:r>
           </w:p>
         </w:tc>
@@ -2078,12 +2145,21 @@
                 <w:rFonts w:eastAsiaTheme="minorHAnsi"/>
               </w:rPr>
             </w:pPr>
+            <w:proofErr w:type="spellStart"/>
             <w:r>
               <w:rPr>
                 <w:rStyle w:val="HTMLCode"/>
                 <w:rFonts w:eastAsiaTheme="minorHAnsi"/>
               </w:rPr>
-              <w:t>SaveDocumentBlob()</w:t>
+              <w:t>SaveDocumentBlob</w:t>
+            </w:r>
+            <w:proofErr w:type="spellEnd"/>
+            <w:r>
+              <w:rPr>
+                <w:rStyle w:val="HTMLCode"/>
+                <w:rFonts w:eastAsiaTheme="minorHAnsi"/>
+              </w:rPr>
+              <w:t>()</w:t>
             </w:r>
           </w:p>
         </w:tc>
@@ -2263,12 +2339,21 @@
                 <w:rFonts w:eastAsiaTheme="minorHAnsi"/>
               </w:rPr>
             </w:pPr>
+            <w:proofErr w:type="spellStart"/>
             <w:r>
               <w:rPr>
                 <w:rStyle w:val="HTMLCode"/>
                 <w:rFonts w:eastAsiaTheme="minorHAnsi"/>
               </w:rPr>
-              <w:t>ExtractPdf()</w:t>
+              <w:t>ExtractPdf</w:t>
+            </w:r>
+            <w:proofErr w:type="spellEnd"/>
+            <w:r>
+              <w:rPr>
+                <w:rStyle w:val="HTMLCode"/>
+                <w:rFonts w:eastAsiaTheme="minorHAnsi"/>
+              </w:rPr>
+              <w:t>()</w:t>
             </w:r>
           </w:p>
         </w:tc>
@@ -2335,12 +2420,21 @@
                 <w:rFonts w:eastAsiaTheme="minorHAnsi"/>
               </w:rPr>
             </w:pPr>
+            <w:proofErr w:type="spellStart"/>
             <w:r>
               <w:rPr>
                 <w:rStyle w:val="HTMLCode"/>
                 <w:rFonts w:eastAsiaTheme="minorHAnsi"/>
               </w:rPr>
-              <w:t>ExtractPdf()</w:t>
+              <w:t>ExtractPdf</w:t>
+            </w:r>
+            <w:proofErr w:type="spellEnd"/>
+            <w:r>
+              <w:rPr>
+                <w:rStyle w:val="HTMLCode"/>
+                <w:rFonts w:eastAsiaTheme="minorHAnsi"/>
+              </w:rPr>
+              <w:t>()</w:t>
             </w:r>
             <w:r>
               <w:rPr>
@@ -2417,12 +2511,21 @@
                 <w:rFonts w:eastAsiaTheme="minorHAnsi"/>
               </w:rPr>
             </w:pPr>
+            <w:proofErr w:type="spellStart"/>
             <w:r>
               <w:rPr>
                 <w:rStyle w:val="HTMLCode"/>
                 <w:rFonts w:eastAsiaTheme="minorHAnsi"/>
               </w:rPr>
-              <w:t>ExtractDocx()</w:t>
+              <w:t>ExtractDocx</w:t>
+            </w:r>
+            <w:proofErr w:type="spellEnd"/>
+            <w:r>
+              <w:rPr>
+                <w:rStyle w:val="HTMLCode"/>
+                <w:rFonts w:eastAsiaTheme="minorHAnsi"/>
+              </w:rPr>
+              <w:t>()</w:t>
             </w:r>
           </w:p>
         </w:tc>
@@ -2603,12 +2706,21 @@
                 <w:rFonts w:eastAsiaTheme="minorHAnsi"/>
               </w:rPr>
             </w:pPr>
+            <w:proofErr w:type="spellStart"/>
             <w:r>
               <w:rPr>
                 <w:rStyle w:val="HTMLCode"/>
                 <w:rFonts w:eastAsiaTheme="minorHAnsi"/>
               </w:rPr>
-              <w:t>SearchFullText("Rechnung")</w:t>
+              <w:t>SearchFullText</w:t>
+            </w:r>
+            <w:proofErr w:type="spellEnd"/>
+            <w:r>
+              <w:rPr>
+                <w:rStyle w:val="HTMLCode"/>
+                <w:rFonts w:eastAsiaTheme="minorHAnsi"/>
+              </w:rPr>
+              <w:t>("Rechnung")</w:t>
             </w:r>
           </w:p>
         </w:tc>
@@ -2672,12 +2784,21 @@
                 <w:rFonts w:eastAsiaTheme="minorHAnsi"/>
               </w:rPr>
             </w:pPr>
+            <w:proofErr w:type="spellStart"/>
             <w:r>
               <w:rPr>
                 <w:rStyle w:val="HTMLCode"/>
                 <w:rFonts w:eastAsiaTheme="minorHAnsi"/>
               </w:rPr>
-              <w:t>GenerateSnippet()</w:t>
+              <w:t>GenerateSnippet</w:t>
+            </w:r>
+            <w:proofErr w:type="spellEnd"/>
+            <w:r>
+              <w:rPr>
+                <w:rStyle w:val="HTMLCode"/>
+                <w:rFonts w:eastAsiaTheme="minorHAnsi"/>
+              </w:rPr>
+              <w:t>()</w:t>
             </w:r>
           </w:p>
         </w:tc>
@@ -2858,12 +2979,21 @@
                 <w:rFonts w:eastAsiaTheme="minorHAnsi"/>
               </w:rPr>
             </w:pPr>
+            <w:proofErr w:type="spellStart"/>
             <w:r>
               <w:rPr>
                 <w:rStyle w:val="HTMLCode"/>
                 <w:rFonts w:eastAsiaTheme="minorHAnsi"/>
               </w:rPr>
-              <w:t>FileWatcherService.OnCreated()</w:t>
+              <w:t>FileWatcherService.OnCreated</w:t>
+            </w:r>
+            <w:proofErr w:type="spellEnd"/>
+            <w:r>
+              <w:rPr>
+                <w:rStyle w:val="HTMLCode"/>
+                <w:rFonts w:eastAsiaTheme="minorHAnsi"/>
+              </w:rPr>
+              <w:t>()</w:t>
             </w:r>
           </w:p>
         </w:tc>
@@ -2927,12 +3057,21 @@
                 <w:rFonts w:eastAsiaTheme="minorHAnsi"/>
               </w:rPr>
             </w:pPr>
+            <w:proofErr w:type="spellStart"/>
             <w:r>
               <w:rPr>
                 <w:rStyle w:val="HTMLCode"/>
                 <w:rFonts w:eastAsiaTheme="minorHAnsi"/>
               </w:rPr>
-              <w:t>StartWatching()</w:t>
+              <w:t>StartWatching</w:t>
+            </w:r>
+            <w:proofErr w:type="spellEnd"/>
+            <w:r>
+              <w:rPr>
+                <w:rStyle w:val="HTMLCode"/>
+                <w:rFonts w:eastAsiaTheme="minorHAnsi"/>
+              </w:rPr>
+              <w:t>()</w:t>
             </w:r>
           </w:p>
         </w:tc>
@@ -3187,8 +3326,13 @@
                 <w:lang w:eastAsia="de-CH"/>
               </w:rPr>
             </w:pPr>
-            <w:r>
-              <w:t>TreeView Binding</w:t>
+            <w:proofErr w:type="spellStart"/>
+            <w:r>
+              <w:t>TreeView</w:t>
+            </w:r>
+            <w:proofErr w:type="spellEnd"/>
+            <w:r>
+              <w:t xml:space="preserve"> Binding</w:t>
             </w:r>
           </w:p>
         </w:tc>
@@ -3316,8 +3460,13 @@
               <w:spacing w:line="276" w:lineRule="auto"/>
               <w:cnfStyle w:val="000000000000" w:firstRow="0" w:lastRow="0" w:firstColumn="0" w:lastColumn="0" w:oddVBand="0" w:evenVBand="0" w:oddHBand="0" w:evenHBand="0" w:firstRowFirstColumn="0" w:firstRowLastColumn="0" w:lastRowFirstColumn="0" w:lastRowLastColumn="0"/>
             </w:pPr>
-            <w:r>
-              <w:t>Exception-Handling</w:t>
+            <w:proofErr w:type="spellStart"/>
+            <w:r>
+              <w:t>Exception</w:t>
+            </w:r>
+            <w:proofErr w:type="spellEnd"/>
+            <w:r>
+              <w:t>-Handling</w:t>
             </w:r>
           </w:p>
         </w:tc>
@@ -3337,772 +3486,6 @@
         </w:tc>
       </w:tr>
     </w:tbl>
-    <w:p>
-      <w:pPr>
-        <w:spacing w:after="0"/>
-      </w:pPr>
-      <w:r>
-        <w:br w:type="page"/>
-      </w:r>
-    </w:p>
-    <w:p>
-      <w:pPr>
-        <w:rPr>
-          <w:lang w:val="en-US"/>
-        </w:rPr>
-      </w:pPr>
-      <w:r>
-        <w:rPr>
-          <w:lang w:val="en-US"/>
-        </w:rPr>
-        <w:lastRenderedPageBreak/>
-        <w:t>Old.</w:t>
-      </w:r>
-    </w:p>
-    <w:p>
-      <w:pPr>
-        <w:spacing w:after="0"/>
-        <w:rPr>
-          <w:b/>
-          <w:lang w:val="en-US"/>
-        </w:rPr>
-      </w:pPr>
-      <w:r>
-        <w:rPr>
-          <w:b/>
-          <w:lang w:val="en-US"/>
-        </w:rPr>
-        <w:t>White-Box</w:t>
-      </w:r>
-    </w:p>
-    <w:p>
-      <w:pPr>
-        <w:spacing w:before="100" w:beforeAutospacing="1" w:after="100" w:afterAutospacing="1" w:line="240" w:lineRule="auto"/>
-        <w:rPr>
-          <w:rFonts w:ascii="Arial" w:eastAsia="Times New Roman" w:hAnsi="Arial" w:cs="Arial"/>
-          <w:sz w:val="20"/>
-          <w:szCs w:val="20"/>
-          <w:lang w:val="en-US" w:eastAsia="de-CH"/>
-        </w:rPr>
-      </w:pPr>
-      <w:r>
-        <w:rPr>
-          <w:rFonts w:ascii="Arial" w:eastAsia="Times New Roman" w:hAnsi="Arial" w:cs="Arial"/>
-          <w:b/>
-          <w:bCs/>
-          <w:sz w:val="20"/>
-          <w:szCs w:val="20"/>
-          <w:lang w:val="en-US" w:eastAsia="de-CH"/>
-        </w:rPr>
-        <w:t>Data Layer:</w:t>
-      </w:r>
-    </w:p>
-    <w:p>
-      <w:pPr>
-        <w:numPr>
-          <w:ilvl w:val="0"/>
-          <w:numId w:val="7"/>
-        </w:numPr>
-        <w:spacing w:before="100" w:beforeAutospacing="1" w:after="100" w:afterAutospacing="1" w:line="240" w:lineRule="auto"/>
-        <w:rPr>
-          <w:rFonts w:ascii="Arial" w:eastAsia="Times New Roman" w:hAnsi="Arial" w:cs="Arial"/>
-          <w:sz w:val="20"/>
-          <w:szCs w:val="20"/>
-          <w:lang w:eastAsia="de-CH"/>
-        </w:rPr>
-      </w:pPr>
-      <w:r>
-        <w:rPr>
-          <w:rFonts w:ascii="Arial" w:eastAsia="Times New Roman" w:hAnsi="Arial" w:cs="Arial"/>
-          <w:sz w:val="20"/>
-          <w:szCs w:val="20"/>
-          <w:lang w:eastAsia="de-CH"/>
-        </w:rPr>
-        <w:t>CreateFolder() → DB-Insert korrekt ausgeführt, ID zurückgegeben</w:t>
-      </w:r>
-    </w:p>
-    <w:p>
-      <w:pPr>
-        <w:numPr>
-          <w:ilvl w:val="0"/>
-          <w:numId w:val="7"/>
-        </w:numPr>
-        <w:spacing w:before="100" w:beforeAutospacing="1" w:after="100" w:afterAutospacing="1" w:line="240" w:lineRule="auto"/>
-        <w:rPr>
-          <w:rFonts w:ascii="Arial" w:eastAsia="Times New Roman" w:hAnsi="Arial" w:cs="Arial"/>
-          <w:sz w:val="20"/>
-          <w:szCs w:val="20"/>
-          <w:lang w:eastAsia="de-CH"/>
-        </w:rPr>
-      </w:pPr>
-      <w:r>
-        <w:rPr>
-          <w:rFonts w:ascii="Arial" w:eastAsia="Times New Roman" w:hAnsi="Arial" w:cs="Arial"/>
-          <w:sz w:val="20"/>
-          <w:szCs w:val="20"/>
-          <w:lang w:eastAsia="de-CH"/>
-        </w:rPr>
-        <w:t>GetFoldersByParentId() → Hierarchie-Query liefert nur Unterordner</w:t>
-      </w:r>
-    </w:p>
-    <w:p>
-      <w:pPr>
-        <w:numPr>
-          <w:ilvl w:val="0"/>
-          <w:numId w:val="7"/>
-        </w:numPr>
-        <w:spacing w:before="100" w:beforeAutospacing="1" w:after="100" w:afterAutospacing="1" w:line="240" w:lineRule="auto"/>
-        <w:rPr>
-          <w:rFonts w:ascii="Arial" w:eastAsia="Times New Roman" w:hAnsi="Arial" w:cs="Arial"/>
-          <w:sz w:val="20"/>
-          <w:szCs w:val="20"/>
-          <w:lang w:eastAsia="de-CH"/>
-        </w:rPr>
-      </w:pPr>
-      <w:r>
-        <w:rPr>
-          <w:rFonts w:ascii="Arial" w:eastAsia="Times New Roman" w:hAnsi="Arial" w:cs="Arial"/>
-          <w:sz w:val="20"/>
-          <w:szCs w:val="20"/>
-          <w:lang w:eastAsia="de-CH"/>
-        </w:rPr>
-        <w:t>ValidateFolderName() → Prüft Eindeutigkeit nur auf gleicher Ebene (ParentId)</w:t>
-      </w:r>
-    </w:p>
-    <w:p>
-      <w:pPr>
-        <w:numPr>
-          <w:ilvl w:val="0"/>
-          <w:numId w:val="7"/>
-        </w:numPr>
-        <w:spacing w:before="100" w:beforeAutospacing="1" w:after="100" w:afterAutospacing="1" w:line="240" w:lineRule="auto"/>
-        <w:rPr>
-          <w:rFonts w:ascii="Arial" w:eastAsia="Times New Roman" w:hAnsi="Arial" w:cs="Arial"/>
-          <w:sz w:val="20"/>
-          <w:szCs w:val="20"/>
-          <w:lang w:eastAsia="de-CH"/>
-        </w:rPr>
-      </w:pPr>
-      <w:r>
-        <w:rPr>
-          <w:rFonts w:ascii="Arial" w:eastAsia="Times New Roman" w:hAnsi="Arial" w:cs="Arial"/>
-          <w:sz w:val="20"/>
-          <w:szCs w:val="20"/>
-          <w:lang w:eastAsia="de-CH"/>
-        </w:rPr>
-        <w:t>SaveDocumentBlob() → BLOB und PlainText werden korrekt gespeichert</w:t>
-      </w:r>
-    </w:p>
-    <w:p>
-      <w:pPr>
-        <w:numPr>
-          <w:ilvl w:val="0"/>
-          <w:numId w:val="7"/>
-        </w:numPr>
-        <w:spacing w:before="100" w:beforeAutospacing="1" w:after="100" w:afterAutospacing="1" w:line="240" w:lineRule="auto"/>
-        <w:rPr>
-          <w:rFonts w:ascii="Arial" w:eastAsia="Times New Roman" w:hAnsi="Arial" w:cs="Arial"/>
-          <w:sz w:val="20"/>
-          <w:szCs w:val="20"/>
-          <w:lang w:eastAsia="de-CH"/>
-        </w:rPr>
-      </w:pPr>
-      <w:r>
-        <w:rPr>
-          <w:rFonts w:ascii="Arial" w:eastAsia="Times New Roman" w:hAnsi="Arial" w:cs="Arial"/>
-          <w:sz w:val="20"/>
-          <w:szCs w:val="20"/>
-          <w:lang w:eastAsia="de-CH"/>
-        </w:rPr>
-        <w:t>DeleteFolder() → Cascade Delete funktioniert (oder Exception bei Dokumenten)</w:t>
-      </w:r>
-    </w:p>
-    <w:p>
-      <w:pPr>
-        <w:spacing w:before="100" w:beforeAutospacing="1" w:after="100" w:afterAutospacing="1" w:line="240" w:lineRule="auto"/>
-        <w:rPr>
-          <w:rFonts w:ascii="Arial" w:eastAsia="Times New Roman" w:hAnsi="Arial" w:cs="Arial"/>
-          <w:sz w:val="20"/>
-          <w:szCs w:val="20"/>
-          <w:lang w:eastAsia="de-CH"/>
-        </w:rPr>
-      </w:pPr>
-      <w:r>
-        <w:rPr>
-          <w:rFonts w:ascii="Arial" w:eastAsia="Times New Roman" w:hAnsi="Arial" w:cs="Arial"/>
-          <w:b/>
-          <w:bCs/>
-          <w:sz w:val="20"/>
-          <w:szCs w:val="20"/>
-          <w:lang w:eastAsia="de-CH"/>
-        </w:rPr>
-        <w:t>Business Layer</w:t>
-      </w:r>
-      <w:r>
-        <w:rPr>
-          <w:rFonts w:ascii="Arial" w:eastAsia="Times New Roman" w:hAnsi="Arial" w:cs="Arial"/>
-          <w:b/>
-          <w:bCs/>
-          <w:sz w:val="20"/>
-          <w:szCs w:val="20"/>
-          <w:lang w:eastAsia="de-CH"/>
-        </w:rPr>
-        <w:t>:</w:t>
-      </w:r>
-    </w:p>
-    <w:p>
-      <w:pPr>
-        <w:numPr>
-          <w:ilvl w:val="0"/>
-          <w:numId w:val="8"/>
-        </w:numPr>
-        <w:spacing w:before="100" w:beforeAutospacing="1" w:after="100" w:afterAutospacing="1" w:line="240" w:lineRule="auto"/>
-        <w:rPr>
-          <w:rFonts w:ascii="Arial" w:eastAsia="Times New Roman" w:hAnsi="Arial" w:cs="Arial"/>
-          <w:sz w:val="20"/>
-          <w:szCs w:val="20"/>
-          <w:lang w:eastAsia="de-CH"/>
-        </w:rPr>
-      </w:pPr>
-      <w:r>
-        <w:rPr>
-          <w:rFonts w:ascii="Arial" w:eastAsia="Times New Roman" w:hAnsi="Arial" w:cs="Arial"/>
-          <w:sz w:val="20"/>
-          <w:szCs w:val="20"/>
-          <w:lang w:eastAsia="de-CH"/>
-        </w:rPr>
-        <w:t>TextExtractionService.ExtractPdf() → Text wird korrekt extrahiert, Exception bei fehlerhafte Datei</w:t>
-      </w:r>
-    </w:p>
-    <w:p>
-      <w:pPr>
-        <w:numPr>
-          <w:ilvl w:val="0"/>
-          <w:numId w:val="8"/>
-        </w:numPr>
-        <w:spacing w:before="100" w:beforeAutospacing="1" w:after="100" w:afterAutospacing="1" w:line="240" w:lineRule="auto"/>
-        <w:rPr>
-          <w:rFonts w:ascii="Arial" w:eastAsia="Times New Roman" w:hAnsi="Arial" w:cs="Arial"/>
-          <w:sz w:val="20"/>
-          <w:szCs w:val="20"/>
-          <w:lang w:eastAsia="de-CH"/>
-        </w:rPr>
-      </w:pPr>
-      <w:r>
-        <w:rPr>
-          <w:rFonts w:ascii="Arial" w:eastAsia="Times New Roman" w:hAnsi="Arial" w:cs="Arial"/>
-          <w:sz w:val="20"/>
-          <w:szCs w:val="20"/>
-          <w:lang w:eastAsia="de-CH"/>
-        </w:rPr>
-        <w:t>TextExtractionService.ExtractDocx() → Text wird korrekt extrahiert, Exception-Handling</w:t>
-      </w:r>
-    </w:p>
-    <w:p>
-      <w:pPr>
-        <w:numPr>
-          <w:ilvl w:val="0"/>
-          <w:numId w:val="8"/>
-        </w:numPr>
-        <w:spacing w:before="100" w:beforeAutospacing="1" w:after="100" w:afterAutospacing="1" w:line="240" w:lineRule="auto"/>
-        <w:rPr>
-          <w:rFonts w:ascii="Arial" w:eastAsia="Times New Roman" w:hAnsi="Arial" w:cs="Arial"/>
-          <w:sz w:val="20"/>
-          <w:szCs w:val="20"/>
-          <w:lang w:eastAsia="de-CH"/>
-        </w:rPr>
-      </w:pPr>
-      <w:r>
-        <w:rPr>
-          <w:rFonts w:ascii="Arial" w:eastAsia="Times New Roman" w:hAnsi="Arial" w:cs="Arial"/>
-          <w:sz w:val="20"/>
-          <w:szCs w:val="20"/>
-          <w:lang w:eastAsia="de-CH"/>
-        </w:rPr>
-        <w:t>DocumentService.ValidateFileType() → Nur PDF/DOCX erlaubt, andere abgelehnt</w:t>
-      </w:r>
-    </w:p>
-    <w:p>
-      <w:pPr>
-        <w:numPr>
-          <w:ilvl w:val="0"/>
-          <w:numId w:val="8"/>
-        </w:numPr>
-        <w:spacing w:before="100" w:beforeAutospacing="1" w:after="100" w:afterAutospacing="1" w:line="240" w:lineRule="auto"/>
-        <w:rPr>
-          <w:rFonts w:ascii="Arial" w:eastAsia="Times New Roman" w:hAnsi="Arial" w:cs="Arial"/>
-          <w:sz w:val="20"/>
-          <w:szCs w:val="20"/>
-          <w:lang w:eastAsia="de-CH"/>
-        </w:rPr>
-      </w:pPr>
-      <w:r>
-        <w:rPr>
-          <w:rFonts w:ascii="Arial" w:eastAsia="Times New Roman" w:hAnsi="Arial" w:cs="Arial"/>
-          <w:sz w:val="20"/>
-          <w:szCs w:val="20"/>
-          <w:lang w:eastAsia="de-CH"/>
-        </w:rPr>
-        <w:t>SearchService.SearchFullText() → LIKE-Query korrekt konstruiert mit Contains()</w:t>
-      </w:r>
-    </w:p>
-    <w:p>
-      <w:pPr>
-        <w:numPr>
-          <w:ilvl w:val="0"/>
-          <w:numId w:val="8"/>
-        </w:numPr>
-        <w:spacing w:before="100" w:beforeAutospacing="1" w:after="100" w:afterAutospacing="1" w:line="240" w:lineRule="auto"/>
-        <w:rPr>
-          <w:rFonts w:ascii="Arial" w:eastAsia="Times New Roman" w:hAnsi="Arial" w:cs="Arial"/>
-          <w:sz w:val="20"/>
-          <w:szCs w:val="20"/>
-          <w:lang w:eastAsia="de-CH"/>
-        </w:rPr>
-      </w:pPr>
-      <w:r>
-        <w:rPr>
-          <w:rFonts w:ascii="Arial" w:eastAsia="Times New Roman" w:hAnsi="Arial" w:cs="Arial"/>
-          <w:sz w:val="20"/>
-          <w:szCs w:val="20"/>
-          <w:lang w:eastAsia="de-CH"/>
-        </w:rPr>
-        <w:t>SearchService.GenerateSnippet() → Snippet mit korrekter Länge und Hervorhebung</w:t>
-      </w:r>
-    </w:p>
-    <w:p>
-      <w:pPr>
-        <w:numPr>
-          <w:ilvl w:val="0"/>
-          <w:numId w:val="8"/>
-        </w:numPr>
-        <w:spacing w:before="100" w:beforeAutospacing="1" w:after="100" w:afterAutospacing="1" w:line="240" w:lineRule="auto"/>
-        <w:rPr>
-          <w:rFonts w:ascii="Arial" w:eastAsia="Times New Roman" w:hAnsi="Arial" w:cs="Arial"/>
-          <w:sz w:val="20"/>
-          <w:szCs w:val="20"/>
-          <w:lang w:eastAsia="de-CH"/>
-        </w:rPr>
-      </w:pPr>
-      <w:r>
-        <w:rPr>
-          <w:rFonts w:ascii="Arial" w:eastAsia="Times New Roman" w:hAnsi="Arial" w:cs="Arial"/>
-          <w:sz w:val="20"/>
-          <w:szCs w:val="20"/>
-          <w:lang w:eastAsia="de-CH"/>
-        </w:rPr>
-        <w:t>FolderService.ValidateUniqueName() → Doppelte Namen auf gleicher Ebene erkannt</w:t>
-      </w:r>
-    </w:p>
-    <w:p>
-      <w:pPr>
-        <w:spacing w:before="100" w:beforeAutospacing="1" w:after="100" w:afterAutospacing="1" w:line="240" w:lineRule="auto"/>
-        <w:rPr>
-          <w:rFonts w:ascii="Arial" w:eastAsia="Times New Roman" w:hAnsi="Arial" w:cs="Arial"/>
-          <w:sz w:val="20"/>
-          <w:szCs w:val="20"/>
-          <w:lang w:eastAsia="de-CH"/>
-        </w:rPr>
-      </w:pPr>
-      <w:r>
-        <w:rPr>
-          <w:rFonts w:ascii="Arial" w:eastAsia="Times New Roman" w:hAnsi="Arial" w:cs="Arial"/>
-          <w:b/>
-          <w:bCs/>
-          <w:sz w:val="20"/>
-          <w:szCs w:val="20"/>
-          <w:lang w:eastAsia="de-CH"/>
-        </w:rPr>
-        <w:t>File Watcher:</w:t>
-      </w:r>
-    </w:p>
-    <w:p>
-      <w:pPr>
-        <w:numPr>
-          <w:ilvl w:val="0"/>
-          <w:numId w:val="9"/>
-        </w:numPr>
-        <w:spacing w:before="100" w:beforeAutospacing="1" w:after="100" w:afterAutospacing="1" w:line="240" w:lineRule="auto"/>
-        <w:rPr>
-          <w:rFonts w:ascii="Arial" w:eastAsia="Times New Roman" w:hAnsi="Arial" w:cs="Arial"/>
-          <w:sz w:val="20"/>
-          <w:szCs w:val="20"/>
-          <w:lang w:eastAsia="de-CH"/>
-        </w:rPr>
-      </w:pPr>
-      <w:r>
-        <w:rPr>
-          <w:rFonts w:ascii="Arial" w:eastAsia="Times New Roman" w:hAnsi="Arial" w:cs="Arial"/>
-          <w:sz w:val="20"/>
-          <w:szCs w:val="20"/>
-          <w:lang w:eastAsia="de-CH"/>
-        </w:rPr>
-        <w:t>FileWatcherService.OnCreated() → Event wird ausgelöst bei neuer Datei</w:t>
-      </w:r>
-    </w:p>
-    <w:p>
-      <w:pPr>
-        <w:numPr>
-          <w:ilvl w:val="0"/>
-          <w:numId w:val="9"/>
-        </w:numPr>
-        <w:spacing w:before="100" w:beforeAutospacing="1" w:after="100" w:afterAutospacing="1" w:line="240" w:lineRule="auto"/>
-        <w:rPr>
-          <w:rFonts w:ascii="Arial" w:eastAsia="Times New Roman" w:hAnsi="Arial" w:cs="Arial"/>
-          <w:sz w:val="20"/>
-          <w:szCs w:val="20"/>
-          <w:lang w:eastAsia="de-CH"/>
-        </w:rPr>
-      </w:pPr>
-      <w:r>
-        <w:rPr>
-          <w:rFonts w:ascii="Arial" w:eastAsia="Times New Roman" w:hAnsi="Arial" w:cs="Arial"/>
-          <w:sz w:val="20"/>
-          <w:szCs w:val="20"/>
-          <w:lang w:eastAsia="de-CH"/>
-        </w:rPr>
-        <w:t>FileWatcherService.OnCreated() → Nur gültige Dateitypen werden verarbeitet</w:t>
-      </w:r>
-    </w:p>
-    <w:p>
-      <w:pPr>
-        <w:numPr>
-          <w:ilvl w:val="0"/>
-          <w:numId w:val="9"/>
-        </w:numPr>
-        <w:spacing w:before="100" w:beforeAutospacing="1" w:after="100" w:afterAutospacing="1" w:line="240" w:lineRule="auto"/>
-        <w:rPr>
-          <w:rFonts w:ascii="Arial" w:eastAsia="Times New Roman" w:hAnsi="Arial" w:cs="Arial"/>
-          <w:sz w:val="20"/>
-          <w:szCs w:val="20"/>
-          <w:lang w:eastAsia="de-CH"/>
-        </w:rPr>
-      </w:pPr>
-      <w:r>
-        <w:rPr>
-          <w:rFonts w:ascii="Arial" w:eastAsia="Times New Roman" w:hAnsi="Arial" w:cs="Arial"/>
-          <w:sz w:val="20"/>
-          <w:szCs w:val="20"/>
-          <w:lang w:eastAsia="de-CH"/>
-        </w:rPr>
-        <w:t>FileWatcherService.StartWatching() → Watcher startet und überwacht korrekten Pfad</w:t>
-      </w:r>
-    </w:p>
-    <w:p>
-      <w:pPr>
-        <w:numPr>
-          <w:ilvl w:val="0"/>
-          <w:numId w:val="9"/>
-        </w:numPr>
-        <w:spacing w:before="100" w:beforeAutospacing="1" w:after="100" w:afterAutospacing="1" w:line="240" w:lineRule="auto"/>
-        <w:rPr>
-          <w:rFonts w:ascii="Arial" w:eastAsia="Times New Roman" w:hAnsi="Arial" w:cs="Arial"/>
-          <w:sz w:val="20"/>
-          <w:szCs w:val="20"/>
-          <w:lang w:eastAsia="de-CH"/>
-        </w:rPr>
-      </w:pPr>
-      <w:r>
-        <w:rPr>
-          <w:rFonts w:ascii="Arial" w:eastAsia="Times New Roman" w:hAnsi="Arial" w:cs="Arial"/>
-          <w:sz w:val="20"/>
-          <w:szCs w:val="20"/>
-          <w:lang w:eastAsia="de-CH"/>
-        </w:rPr>
-        <w:t>Exception bei nicht existierendem Watcher-Pfad → Fehler wird abgefangen</w:t>
-      </w:r>
-    </w:p>
-    <w:p>
-      <w:pPr>
-        <w:numPr>
-          <w:ilvl w:val="0"/>
-          <w:numId w:val="9"/>
-        </w:numPr>
-        <w:spacing w:before="100" w:beforeAutospacing="1" w:after="100" w:afterAutospacing="1" w:line="240" w:lineRule="auto"/>
-        <w:rPr>
-          <w:rFonts w:ascii="Arial" w:eastAsia="Times New Roman" w:hAnsi="Arial" w:cs="Arial"/>
-          <w:sz w:val="20"/>
-          <w:szCs w:val="20"/>
-          <w:lang w:eastAsia="de-CH"/>
-        </w:rPr>
-      </w:pPr>
-      <w:r>
-        <w:rPr>
-          <w:rFonts w:ascii="Arial" w:eastAsia="Times New Roman" w:hAnsi="Arial" w:cs="Arial"/>
-          <w:sz w:val="20"/>
-          <w:szCs w:val="20"/>
-          <w:lang w:eastAsia="de-CH"/>
-        </w:rPr>
-        <w:t>Thread-Safety → Mehrere gleichzeitige Dateien werden korrekt verarbeitet</w:t>
-      </w:r>
-    </w:p>
-    <w:p>
-      <w:pPr>
-        <w:spacing w:before="100" w:beforeAutospacing="1" w:after="100" w:afterAutospacing="1" w:line="240" w:lineRule="auto"/>
-        <w:rPr>
-          <w:rFonts w:ascii="Arial" w:eastAsia="Times New Roman" w:hAnsi="Arial" w:cs="Arial"/>
-          <w:sz w:val="20"/>
-          <w:szCs w:val="20"/>
-          <w:lang w:eastAsia="de-CH"/>
-        </w:rPr>
-      </w:pPr>
-      <w:r>
-        <w:rPr>
-          <w:rFonts w:ascii="Arial" w:eastAsia="Times New Roman" w:hAnsi="Arial" w:cs="Arial"/>
-          <w:b/>
-          <w:bCs/>
-          <w:sz w:val="20"/>
-          <w:szCs w:val="20"/>
-          <w:lang w:eastAsia="de-CH"/>
-        </w:rPr>
-        <w:t>GUI-Logik:</w:t>
-      </w:r>
-    </w:p>
-    <w:p>
-      <w:pPr>
-        <w:numPr>
-          <w:ilvl w:val="0"/>
-          <w:numId w:val="10"/>
-        </w:numPr>
-        <w:spacing w:before="100" w:beforeAutospacing="1" w:after="100" w:afterAutospacing="1" w:line="240" w:lineRule="auto"/>
-        <w:rPr>
-          <w:rFonts w:ascii="Arial" w:eastAsia="Times New Roman" w:hAnsi="Arial" w:cs="Arial"/>
-          <w:sz w:val="20"/>
-          <w:szCs w:val="20"/>
-          <w:lang w:eastAsia="de-CH"/>
-        </w:rPr>
-      </w:pPr>
-      <w:r>
-        <w:rPr>
-          <w:rFonts w:ascii="Arial" w:eastAsia="Times New Roman" w:hAnsi="Arial" w:cs="Arial"/>
-          <w:sz w:val="20"/>
-          <w:szCs w:val="20"/>
-          <w:lang w:eastAsia="de-CH"/>
-        </w:rPr>
-        <w:t>Event-Handler für Button-Clicks → Korrekte Service-Methode wird aufgerufen</w:t>
-      </w:r>
-    </w:p>
-    <w:p>
-      <w:pPr>
-        <w:numPr>
-          <w:ilvl w:val="0"/>
-          <w:numId w:val="10"/>
-        </w:numPr>
-        <w:spacing w:before="100" w:beforeAutospacing="1" w:after="100" w:afterAutospacing="1" w:line="240" w:lineRule="auto"/>
-        <w:rPr>
-          <w:rFonts w:ascii="Arial" w:eastAsia="Times New Roman" w:hAnsi="Arial" w:cs="Arial"/>
-          <w:sz w:val="20"/>
-          <w:szCs w:val="20"/>
-          <w:lang w:eastAsia="de-CH"/>
-        </w:rPr>
-      </w:pPr>
-      <w:r>
-        <w:rPr>
-          <w:rFonts w:ascii="Arial" w:eastAsia="Times New Roman" w:hAnsi="Arial" w:cs="Arial"/>
-          <w:sz w:val="20"/>
-          <w:szCs w:val="20"/>
-          <w:lang w:eastAsia="de-CH"/>
-        </w:rPr>
-        <w:t xml:space="preserve">TreeView DataBinding → </w:t>
-      </w:r>
-      <w:r>
-        <w:rPr>
-          <w:rFonts w:ascii="Arial" w:eastAsia="Times New Roman" w:hAnsi="Arial" w:cs="Arial"/>
-          <w:color w:val="FF0000"/>
-          <w:sz w:val="20"/>
-          <w:szCs w:val="20"/>
-          <w:lang w:eastAsia="de-CH"/>
-        </w:rPr>
-        <w:t>Ordnerstruktur aktualisiert sich bei DB-Änderung</w:t>
-      </w:r>
-    </w:p>
-    <w:p>
-      <w:pPr>
-        <w:numPr>
-          <w:ilvl w:val="0"/>
-          <w:numId w:val="10"/>
-        </w:numPr>
-        <w:spacing w:before="100" w:beforeAutospacing="1" w:after="100" w:afterAutospacing="1" w:line="240" w:lineRule="auto"/>
-        <w:rPr>
-          <w:rFonts w:ascii="Arial" w:eastAsia="Times New Roman" w:hAnsi="Arial" w:cs="Arial"/>
-          <w:color w:val="FF0000"/>
-          <w:sz w:val="20"/>
-          <w:szCs w:val="20"/>
-          <w:lang w:eastAsia="de-CH"/>
-        </w:rPr>
-      </w:pPr>
-      <w:r>
-        <w:rPr>
-          <w:rFonts w:ascii="Arial" w:eastAsia="Times New Roman" w:hAnsi="Arial" w:cs="Arial"/>
-          <w:sz w:val="20"/>
-          <w:szCs w:val="20"/>
-          <w:lang w:eastAsia="de-CH"/>
-        </w:rPr>
-        <w:t xml:space="preserve">ListView DataBinding → </w:t>
-      </w:r>
-      <w:r>
-        <w:rPr>
-          <w:rFonts w:ascii="Arial" w:eastAsia="Times New Roman" w:hAnsi="Arial" w:cs="Arial"/>
-          <w:color w:val="FF0000"/>
-          <w:sz w:val="20"/>
-          <w:szCs w:val="20"/>
-          <w:lang w:eastAsia="de-CH"/>
-        </w:rPr>
-        <w:t>Suchergebnisse werden korrekt angezeigt</w:t>
-      </w:r>
-    </w:p>
-    <w:p>
-      <w:pPr>
-        <w:numPr>
-          <w:ilvl w:val="0"/>
-          <w:numId w:val="10"/>
-        </w:numPr>
-        <w:spacing w:before="100" w:beforeAutospacing="1" w:after="100" w:afterAutospacing="1" w:line="240" w:lineRule="auto"/>
-        <w:rPr>
-          <w:rFonts w:ascii="Arial" w:eastAsia="Times New Roman" w:hAnsi="Arial" w:cs="Arial"/>
-          <w:sz w:val="20"/>
-          <w:szCs w:val="20"/>
-          <w:lang w:eastAsia="de-CH"/>
-        </w:rPr>
-      </w:pPr>
-      <w:r>
-        <w:rPr>
-          <w:rFonts w:ascii="Arial" w:eastAsia="Times New Roman" w:hAnsi="Arial" w:cs="Arial"/>
-          <w:sz w:val="20"/>
-          <w:szCs w:val="20"/>
-          <w:lang w:eastAsia="de-CH"/>
-        </w:rPr>
-        <w:t xml:space="preserve">Input-Validierung → </w:t>
-      </w:r>
-      <w:r>
-        <w:rPr>
-          <w:rFonts w:ascii="Arial" w:eastAsia="Times New Roman" w:hAnsi="Arial" w:cs="Arial"/>
-          <w:color w:val="FF0000"/>
-          <w:sz w:val="20"/>
-          <w:szCs w:val="20"/>
-          <w:lang w:eastAsia="de-CH"/>
-        </w:rPr>
-        <w:t>Leere Ordnernamen werden abgelehnt</w:t>
-      </w:r>
-    </w:p>
-    <w:p>
-      <w:pPr>
-        <w:numPr>
-          <w:ilvl w:val="0"/>
-          <w:numId w:val="10"/>
-        </w:numPr>
-        <w:spacing w:before="100" w:beforeAutospacing="1" w:after="100" w:afterAutospacing="1" w:line="240" w:lineRule="auto"/>
-        <w:rPr>
-          <w:rFonts w:ascii="Arial" w:eastAsia="Times New Roman" w:hAnsi="Arial" w:cs="Arial"/>
-          <w:sz w:val="20"/>
-          <w:szCs w:val="20"/>
-          <w:lang w:eastAsia="de-CH"/>
-        </w:rPr>
-      </w:pPr>
-      <w:r>
-        <w:rPr>
-          <w:rFonts w:ascii="Arial" w:eastAsia="Times New Roman" w:hAnsi="Arial" w:cs="Arial"/>
-          <w:sz w:val="20"/>
-          <w:szCs w:val="20"/>
-          <w:lang w:eastAsia="de-CH"/>
-        </w:rPr>
-        <w:t>Exception-Handling in GUI → Try-Catch fängt Fehler ab, zeigt Meldung</w:t>
-      </w:r>
-    </w:p>
-    <w:p>
-      <w:pPr>
-        <w:spacing w:before="100" w:beforeAutospacing="1" w:after="100" w:afterAutospacing="1" w:line="240" w:lineRule="auto"/>
-        <w:rPr>
-          <w:rFonts w:ascii="Arial" w:eastAsia="Times New Roman" w:hAnsi="Arial" w:cs="Arial"/>
-          <w:sz w:val="20"/>
-          <w:szCs w:val="20"/>
-          <w:lang w:eastAsia="de-CH"/>
-        </w:rPr>
-      </w:pPr>
-      <w:r>
-        <w:rPr>
-          <w:rFonts w:ascii="Arial" w:eastAsia="Times New Roman" w:hAnsi="Arial" w:cs="Arial"/>
-          <w:b/>
-          <w:bCs/>
-          <w:sz w:val="20"/>
-          <w:szCs w:val="20"/>
-          <w:lang w:eastAsia="de-CH"/>
-        </w:rPr>
-        <w:t>Code-Coverage:</w:t>
-      </w:r>
-    </w:p>
-    <w:p>
-      <w:pPr>
-        <w:numPr>
-          <w:ilvl w:val="0"/>
-          <w:numId w:val="11"/>
-        </w:numPr>
-        <w:spacing w:before="100" w:beforeAutospacing="1" w:after="100" w:afterAutospacing="1" w:line="240" w:lineRule="auto"/>
-        <w:rPr>
-          <w:rFonts w:ascii="Arial" w:eastAsia="Times New Roman" w:hAnsi="Arial" w:cs="Arial"/>
-          <w:sz w:val="20"/>
-          <w:szCs w:val="20"/>
-          <w:lang w:eastAsia="de-CH"/>
-        </w:rPr>
-      </w:pPr>
-      <w:r>
-        <w:rPr>
-          <w:rFonts w:ascii="Arial" w:eastAsia="Times New Roman" w:hAnsi="Arial" w:cs="Arial"/>
-          <w:sz w:val="20"/>
-          <w:szCs w:val="20"/>
-          <w:lang w:eastAsia="de-CH"/>
-        </w:rPr>
-        <w:t>Alle CRUD-Operationen durchlaufen → Mindestens 80% Coverage</w:t>
-      </w:r>
-    </w:p>
-    <w:p>
-      <w:pPr>
-        <w:numPr>
-          <w:ilvl w:val="0"/>
-          <w:numId w:val="11"/>
-        </w:numPr>
-        <w:spacing w:before="100" w:beforeAutospacing="1" w:after="100" w:afterAutospacing="1" w:line="240" w:lineRule="auto"/>
-        <w:rPr>
-          <w:rFonts w:ascii="Arial" w:eastAsia="Times New Roman" w:hAnsi="Arial" w:cs="Arial"/>
-          <w:sz w:val="20"/>
-          <w:szCs w:val="20"/>
-          <w:lang w:eastAsia="de-CH"/>
-        </w:rPr>
-      </w:pPr>
-      <w:r>
-        <w:rPr>
-          <w:rFonts w:ascii="Arial" w:eastAsia="Times New Roman" w:hAnsi="Arial" w:cs="Arial"/>
-          <w:sz w:val="20"/>
-          <w:szCs w:val="20"/>
-          <w:lang w:eastAsia="de-CH"/>
-        </w:rPr>
-        <w:t>Alle Exception-Handler getestet → Catch-Blöcke durch provozierte Fehler erreicht</w:t>
-      </w:r>
-    </w:p>
-    <w:p>
-      <w:pPr>
-        <w:numPr>
-          <w:ilvl w:val="0"/>
-          <w:numId w:val="11"/>
-        </w:numPr>
-        <w:spacing w:before="100" w:beforeAutospacing="1" w:after="100" w:afterAutospacing="1" w:line="240" w:lineRule="auto"/>
-        <w:rPr>
-          <w:rFonts w:ascii="Arial" w:eastAsia="Times New Roman" w:hAnsi="Arial" w:cs="Arial"/>
-          <w:sz w:val="20"/>
-          <w:szCs w:val="20"/>
-          <w:lang w:eastAsia="de-CH"/>
-        </w:rPr>
-      </w:pPr>
-      <w:r>
-        <w:rPr>
-          <w:rFonts w:ascii="Arial" w:eastAsia="Times New Roman" w:hAnsi="Arial" w:cs="Arial"/>
-          <w:sz w:val="20"/>
-          <w:szCs w:val="20"/>
-          <w:lang w:eastAsia="de-CH"/>
-        </w:rPr>
-        <w:t>Boundary-Tests → Null-Werte, leere Strings, Maximalwerte getestet</w:t>
-      </w:r>
-    </w:p>
     <w:p>
       <w:pPr>
         <w:spacing w:after="0"/>
@@ -7099,9 +6482,16 @@
 <file path=customXml/itemProps1.xml><?xml version="1.0" encoding="utf-8"?>
 <ds:datastoreItem xmlns:ds="http://schemas.openxmlformats.org/officeDocument/2006/customXml" ds:itemID="{BD76C2CB-D180-474F-9052-765D1C487636}">
   <ds:schemaRefs>
+    <ds:schemaRef ds:uri="http://purl.org/dc/elements/1.1/"/>
+    <ds:schemaRef ds:uri="http://www.w3.org/XML/1998/namespace"/>
+    <ds:schemaRef ds:uri="http://schemas.microsoft.com/office/2006/documentManagement/types"/>
+    <ds:schemaRef ds:uri="http://schemas.openxmlformats.org/package/2006/metadata/core-properties"/>
+    <ds:schemaRef ds:uri="http://schemas.microsoft.com/office/infopath/2007/PartnerControls"/>
     <ds:schemaRef ds:uri="http://schemas.microsoft.com/office/2006/metadata/properties"/>
-    <ds:schemaRef ds:uri="http://schemas.microsoft.com/office/infopath/2007/PartnerControls"/>
+    <ds:schemaRef ds:uri="http://purl.org/dc/terms/"/>
+    <ds:schemaRef ds:uri="3fea549e-0f0f-4b42-9f65-2f6fbc61ff62"/>
     <ds:schemaRef ds:uri="10af284a-957f-4497-9e5b-3e7f84291a81"/>
+    <ds:schemaRef ds:uri="http://purl.org/dc/dcmitype/"/>
   </ds:schemaRefs>
 </ds:datastoreItem>
 </file>

</xml_diff>